<commit_message>
Sincroniza com o main mantendo as coordenadas desta maquina
Traz todo o conteudo atual do main: planos FAMILIA INTEGRAL e FAMILIA
PARTICIPATIVO, calcular_anos_para_gerar unificado, modelos 2026 corrigidos
(faixa preta e transbordo do banner), corrigir_modelo.py, .gitignore e os
percentuais de ago/2026 em diante no valores.csv, que aqui estavam 0%.

Preserva as coordenadas de tela desta branch (COORD de autofill_cassi.py e
searcher.py, e x_fim), calibradas para uso em monitor unico.

Diferenca em relacao ao main fica restrita a essas coordenadas.
</commit_message>
<xml_diff>
--- a/modelos/2024/familia2ae.docx
+++ b/modelos/2024/familia2ae.docx
@@ -821,337 +821,83 @@
                                                                 <w:p>
                                                                   <w:pPr>
                                                                     <w:suppressLineNumbers w:val="0"/>
-                                                                    <w:bidi w:val="0"/>
-                                                                    <w:spacing w:before="0" w:beforeAutospacing="off" w:after="240" w:afterAutospacing="off" w:line="240" w:lineRule="auto"/>
-                                                                    <w:ind/>
+                                                                    <w:spacing w:before="0" w:after="240" w:line="240" w:lineRule="auto"/>
                                                                     <w:jc w:val="both"/>
                                                                     <w:rPr>
                                                                       <w:rFonts w:ascii="Verdana" w:hAnsi="Verdana" w:eastAsia="Verdana" w:cs="Verdana"/>
                                                                       <w:color w:val="auto"/>
                                                                       <w:sz w:val="16"/>
                                                                       <w:szCs w:val="16"/>
-                                                                      <w:lang w:eastAsia="pt-BR" w:bidi="ar-SA"/>
                                                                     </w:rPr>
                                                                   </w:pPr>
                                                                   <w:r>
                                                                     <w:rPr>
                                                                       <w:rFonts w:ascii="Verdana" w:hAnsi="Verdana" w:eastAsia="Verdana" w:cs="Verdana"/>
-                                                                      <w:color w:val="auto"/>
-                                                                      <w:sz w:val="16"/>
-                                                                      <w:szCs w:val="16"/>
-                                                                      <w:lang w:eastAsia="pt-BR" w:bidi="ar-SA"/>
+                                                                      <w:kern w:val="2"/>
+                                                                      <w:sz w:val="16"/>
+                                                                      <w:szCs w:val="16"/>
                                                                     </w:rPr>
                                                                     <w:t xml:space="preserve">Nos termos do seu Contrato de Adesão ao </w:t>
                                                                   </w:r>
                                                                   <w:r>
                                                                     <w:rPr>
                                                                       <w:rFonts w:ascii="Verdana" w:hAnsi="Verdana" w:eastAsia="Verdana" w:cs="Verdana"/>
-                                                                      <w:b w:val="1"/>
-                                                                      <w:bCs w:val="1"/>
-                                                                      <w:color w:val="auto"/>
-                                                                      <w:sz w:val="16"/>
-                                                                      <w:szCs w:val="16"/>
-                                                                      <w:lang w:eastAsia="pt-BR" w:bidi="ar-SA"/>
+                                                                      <w:b/>
+                                                                      <w:bCs/>
+                                                                      <w:kern w:val="2"/>
+                                                                      <w:sz w:val="16"/>
+                                                                      <w:szCs w:val="16"/>
                                                                     </w:rPr>
                                                                     <w:t>Plano CASSI Família II</w:t>
                                                                   </w:r>
                                                                   <w:r>
                                                                     <w:rPr>
                                                                       <w:rFonts w:ascii="Verdana" w:hAnsi="Verdana" w:eastAsia="Verdana" w:cs="Verdana"/>
-                                                                      <w:color w:val="auto"/>
-                                                                      <w:sz w:val="16"/>
-                                                                      <w:szCs w:val="16"/>
-                                                                      <w:lang w:eastAsia="pt-BR" w:bidi="ar-SA"/>
-                                                                    </w:rPr>
-                                                                    <w:t xml:space="preserve">, o valor da mensalidade sofrerá reajuste atuarial anual </w:t>
-                                                                  </w:r>
-                                                                  <w:r>
-                                                                    <w:rPr>
-                                                                      <w:rFonts w:ascii="Verdana" w:hAnsi="Verdana" w:eastAsia="Verdana" w:cs="Verdana"/>
-                                                                      <w:b w:val="0"/>
-                                                                      <w:bCs w:val="0"/>
-                                                                      <w:color w:val="auto"/>
-                                                                      <w:sz w:val="16"/>
-                                                                      <w:szCs w:val="16"/>
-                                                                      <w:lang w:eastAsia="pt-BR" w:bidi="ar-SA"/>
-                                                                    </w:rPr>
-                                                                    <w:t>de</w:t>
-                                                                  </w:r>
-                                                                  <w:r>
-                                                                    <w:rPr>
-                                                                      <w:rFonts w:ascii="Verdana" w:hAnsi="Verdana" w:eastAsia="Verdana" w:cs="Verdana"/>
-                                                                      <w:b w:val="0"/>
-                                                                      <w:bCs w:val="0"/>
-                                                                      <w:color w:val="auto"/>
-                                                                      <w:sz w:val="16"/>
-                                                                      <w:szCs w:val="16"/>
-                                                                      <w:lang w:eastAsia="pt-BR" w:bidi="ar-SA"/>
-                                                                    </w:rPr>
-                                                                    <w:t xml:space="preserve"> </w:t>
-                                                                  </w:r>
-                                                                  <w:r>
-                                                                    <w:rPr>
-                                                                      <w:rFonts w:ascii="Verdana" w:hAnsi="Verdana" w:eastAsia="Verdana" w:cs="Verdana"/>
-                                                                      <w:b w:val="0"/>
-                                                                      <w:bCs w:val="0"/>
-                                                                      <w:color w:val="auto"/>
-                                                                      <w:sz w:val="16"/>
-                                                                      <w:szCs w:val="16"/>
-                                                                      <w:lang w:eastAsia="pt-BR" w:bidi="ar-SA"/>
-                                                                    </w:rPr>
-                                                                    <w:t xml:space="preserve">{{ </w:t>
-                                                                  </w:r>
-                                                                  <w:r>
-                                                                    <w:rPr>
-                                                                      <w:rFonts w:ascii="Verdana" w:hAnsi="Verdana" w:eastAsia="Verdana" w:cs="Verdana"/>
-                                                                      <w:b w:val="1"/>
-                                                                      <w:bCs w:val="1"/>
-                                                                      <w:color w:val="auto"/>
-                                                                      <w:sz w:val="16"/>
-                                                                      <w:szCs w:val="16"/>
-                                                                      <w:lang w:eastAsia="pt-BR" w:bidi="ar-SA"/>
-                                                                    </w:rPr>
-                                                                    <w:t>PORCENTAGEMAUMENTO</w:t>
-                                                                  </w:r>
-                                                                  <w:r>
-                                                                    <w:rPr>
-                                                                      <w:rFonts w:ascii="Verdana" w:hAnsi="Verdana" w:eastAsia="Verdana" w:cs="Verdana"/>
-                                                                      <w:b w:val="1"/>
-                                                                      <w:bCs w:val="1"/>
-                                                                      <w:color w:val="auto"/>
-                                                                      <w:sz w:val="16"/>
-                                                                      <w:szCs w:val="16"/>
-                                                                      <w:lang w:eastAsia="pt-BR" w:bidi="ar-SA"/>
-                                                                    </w:rPr>
-                                                                    <w:t xml:space="preserve"> </w:t>
-                                                                  </w:r>
-                                                                  <w:r>
-                                                                    <w:rPr>
-                                                                      <w:rFonts w:ascii="Verdana" w:hAnsi="Verdana" w:eastAsia="Verdana" w:cs="Verdana"/>
-                                                                      <w:b w:val="1"/>
-                                                                      <w:bCs w:val="1"/>
-                                                                      <w:color w:val="auto"/>
-                                                                      <w:sz w:val="16"/>
-                                                                      <w:szCs w:val="16"/>
-                                                                      <w:lang w:eastAsia="pt-BR" w:bidi="ar-SA"/>
-                                                                    </w:rPr>
-                                                                    <w:t>}}</w:t>
-                                                                  </w:r>
-                                                                  <w:r>
-                                                                    <w:rPr>
-                                                                      <w:rFonts w:ascii="Verdana" w:hAnsi="Verdana" w:eastAsia="Verdana" w:cs="Verdana"/>
-                                                                      <w:b w:val="1"/>
-                                                                      <w:bCs w:val="1"/>
-                                                                      <w:color w:val="auto"/>
-                                                                      <w:sz w:val="16"/>
-                                                                      <w:szCs w:val="16"/>
-                                                                      <w:lang w:eastAsia="pt-BR" w:bidi="ar-SA"/>
-                                                                    </w:rPr>
-                                                                    <w:t xml:space="preserve"> </w:t>
-                                                                  </w:r>
-                                                                  <w:r>
-                                                                    <w:rPr>
-                                                                      <w:rFonts w:ascii="Verdana" w:hAnsi="Verdana" w:eastAsia="Verdana" w:cs="Verdana"/>
-                                                                      <w:color w:val="auto"/>
-                                                                      <w:sz w:val="16"/>
-                                                                      <w:szCs w:val="16"/>
-                                                                      <w:lang w:eastAsia="pt-BR" w:bidi="ar-SA"/>
-                                                                    </w:rPr>
-                                                                    <w:t>a</w:t>
-                                                                  </w:r>
-                                                                  <w:r>
-                                                                    <w:rPr>
-                                                                      <w:rFonts w:ascii="Verdana" w:hAnsi="Verdana" w:eastAsia="Verdana" w:cs="Verdana"/>
-                                                                      <w:color w:val="auto"/>
-                                                                      <w:sz w:val="16"/>
-                                                                      <w:szCs w:val="16"/>
-                                                                      <w:lang w:eastAsia="pt-BR" w:bidi="ar-SA"/>
-                                                                    </w:rPr>
-                                                                    <w:t xml:space="preserve"> </w:t>
-                                                                  </w:r>
-                                                                  <w:r>
-                                                                    <w:rPr>
-                                                                      <w:rFonts w:ascii="Verdana" w:hAnsi="Verdana" w:eastAsia="Verdana" w:cs="Verdana"/>
-                                                                      <w:color w:val="auto"/>
-                                                                      <w:sz w:val="16"/>
-                                                                      <w:szCs w:val="16"/>
-                                                                      <w:lang w:eastAsia="pt-BR" w:bidi="ar-SA"/>
-                                                                    </w:rPr>
-                                                                    <w:t xml:space="preserve">partir do mês </w:t>
-                                                                  </w:r>
-                                                                  <w:r>
-                                                                    <w:rPr>
-                                                                      <w:rFonts w:ascii="Verdana" w:hAnsi="Verdana" w:eastAsia="Verdana" w:cs="Verdana"/>
-                                                                      <w:color w:val="auto"/>
-                                                                      <w:sz w:val="16"/>
-                                                                      <w:szCs w:val="16"/>
-                                                                      <w:lang w:eastAsia="pt-BR" w:bidi="ar-SA"/>
-                                                                    </w:rPr>
-                                                                    <w:t>d</w:t>
-                                                                  </w:r>
-                                                                  <w:r>
-                                                                    <w:rPr>
-                                                                      <w:rFonts w:ascii="Verdana" w:hAnsi="Verdana" w:eastAsia="Verdana" w:cs="Verdana"/>
-                                                                      <w:color w:val="auto"/>
-                                                                      <w:sz w:val="16"/>
-                                                                      <w:szCs w:val="16"/>
-                                                                      <w:lang w:eastAsia="pt-BR" w:bidi="ar-SA"/>
-                                                                    </w:rPr>
-                                                                    <w:t>e</w:t>
-                                                                  </w:r>
-                                                                  <w:r>
-                                                                    <w:rPr>
-                                                                      <w:rFonts w:ascii="Verdana" w:hAnsi="Verdana" w:eastAsia="Verdana" w:cs="Verdana"/>
-                                                                      <w:color w:val="auto"/>
-                                                                      <w:sz w:val="16"/>
-                                                                      <w:szCs w:val="16"/>
-                                                                      <w:lang w:eastAsia="pt-BR" w:bidi="ar-SA"/>
-                                                                    </w:rPr>
-                                                                    <w:t xml:space="preserve"> </w:t>
-                                                                  </w:r>
-                                                                  <w:r>
-                                                                    <w:rPr>
-                                                                      <w:rFonts w:ascii="Verdana" w:hAnsi="Verdana" w:eastAsia="Verdana" w:cs="Verdana"/>
-                                                                      <w:color w:val="auto"/>
-                                                                      <w:sz w:val="16"/>
-                                                                      <w:szCs w:val="16"/>
-                                                                      <w:lang w:eastAsia="pt-BR" w:bidi="ar-SA"/>
-                                                                    </w:rPr>
-                                                                    <w:t xml:space="preserve">{{ </w:t>
-                                                                  </w:r>
-                                                                  <w:r>
-                                                                    <w:rPr>
-                                                                      <w:rFonts w:ascii="Verdana" w:hAnsi="Verdana" w:eastAsia="Verdana" w:cs="Verdana"/>
-                                                                      <w:b w:val="1"/>
-                                                                      <w:bCs w:val="1"/>
-                                                                      <w:color w:val="auto"/>
-                                                                      <w:sz w:val="16"/>
-                                                                      <w:szCs w:val="16"/>
-                                                                      <w:lang w:eastAsia="pt-BR" w:bidi="ar-SA"/>
-                                                                    </w:rPr>
-                                                                    <w:t>MESADESAO</w:t>
-                                                                  </w:r>
-                                                                  <w:r>
-                                                                    <w:rPr>
-                                                                      <w:rFonts w:ascii="Verdana" w:hAnsi="Verdana" w:eastAsia="Verdana" w:cs="Verdana"/>
-                                                                      <w:b w:val="1"/>
-                                                                      <w:bCs w:val="1"/>
-                                                                      <w:color w:val="auto"/>
-                                                                      <w:sz w:val="16"/>
-                                                                      <w:szCs w:val="16"/>
-                                                                      <w:lang w:eastAsia="pt-BR" w:bidi="ar-SA"/>
-                                                                    </w:rPr>
-                                                                    <w:t xml:space="preserve"> </w:t>
-                                                                  </w:r>
-                                                                  <w:r>
-                                                                    <w:rPr>
-                                                                      <w:rFonts w:ascii="Verdana" w:hAnsi="Verdana" w:eastAsia="Verdana" w:cs="Verdana"/>
-                                                                      <w:b w:val="1"/>
-                                                                      <w:bCs w:val="1"/>
-                                                                      <w:color w:val="auto"/>
-                                                                      <w:sz w:val="16"/>
-                                                                      <w:szCs w:val="16"/>
-                                                                      <w:lang w:eastAsia="pt-BR" w:bidi="ar-SA"/>
-                                                                    </w:rPr>
-                                                                    <w:t>}}</w:t>
-                                                                  </w:r>
-                                                                  <w:r>
-                                                                    <w:rPr>
-                                                                      <w:rFonts w:ascii="Verdana" w:hAnsi="Verdana" w:eastAsia="Verdana" w:cs="Verdana"/>
-                                                                      <w:b w:val="1"/>
-                                                                      <w:bCs w:val="1"/>
-                                                                      <w:color w:val="auto"/>
-                                                                      <w:sz w:val="16"/>
-                                                                      <w:szCs w:val="16"/>
-                                                                      <w:lang w:eastAsia="pt-BR" w:bidi="ar-SA"/>
-                                                                    </w:rPr>
-                                                                    <w:t>/</w:t>
-                                                                  </w:r>
-                                                                  <w:r>
-                                                                    <w:rPr>
-                                                                      <w:rFonts w:ascii="Verdana" w:hAnsi="Verdana" w:eastAsia="Verdana" w:cs="Verdana"/>
-                                                                      <w:b w:val="1"/>
-                                                                      <w:bCs w:val="1"/>
-                                                                      <w:color w:val="auto"/>
-                                                                      <w:sz w:val="16"/>
-                                                                      <w:szCs w:val="16"/>
-                                                                      <w:lang w:eastAsia="pt-BR" w:bidi="ar-SA"/>
-                                                                    </w:rPr>
-                                                                    <w:t>202</w:t>
-                                                                  </w:r>
-                                                                  <w:r>
-                                                                    <w:rPr>
-                                                                      <w:rFonts w:ascii="Verdana" w:hAnsi="Verdana" w:eastAsia="Verdana" w:cs="Verdana"/>
-                                                                      <w:b w:val="1"/>
-                                                                      <w:bCs w:val="1"/>
-                                                                      <w:color w:val="auto"/>
-                                                                      <w:sz w:val="16"/>
-                                                                      <w:szCs w:val="16"/>
-                                                                      <w:lang w:eastAsia="pt-BR" w:bidi="ar-SA"/>
-                                                                    </w:rPr>
-                                                                    <w:t>4</w:t>
-                                                                  </w:r>
-                                                                  <w:r>
-                                                                    <w:rPr>
-                                                                      <w:rFonts w:ascii="Verdana" w:hAnsi="Verdana" w:eastAsia="Verdana" w:cs="Verdana"/>
-                                                                      <w:b w:val="1"/>
-                                                                      <w:bCs w:val="1"/>
-                                                                      <w:color w:val="auto"/>
-                                                                      <w:sz w:val="16"/>
-                                                                      <w:szCs w:val="16"/>
-                                                                      <w:lang w:eastAsia="pt-BR" w:bidi="ar-SA"/>
-                                                                    </w:rPr>
-                                                                    <w:t xml:space="preserve"> </w:t>
-                                                                  </w:r>
-                                                                  <w:r>
-                                                                    <w:rPr>
-                                                                      <w:rFonts w:ascii="Verdana" w:hAnsi="Verdana" w:eastAsia="Verdana" w:cs="Verdana"/>
-                                                                      <w:color w:val="auto"/>
-                                                                      <w:sz w:val="16"/>
-                                                                      <w:szCs w:val="16"/>
-                                                                      <w:lang w:eastAsia="pt-BR" w:bidi="ar-SA"/>
-                                                                    </w:rPr>
-                                                                    <w:t xml:space="preserve">quando seu </w:t>
-                                                                  </w:r>
-                                                                  <w:r>
-                                                                    <w:rPr>
-                                                                      <w:rFonts w:ascii="Verdana" w:hAnsi="Verdana" w:eastAsia="Verdana" w:cs="Verdana"/>
-                                                                      <w:color w:val="auto"/>
-                                                                      <w:sz w:val="16"/>
-                                                                      <w:szCs w:val="16"/>
-                                                                      <w:lang w:eastAsia="pt-BR" w:bidi="ar-SA"/>
-                                                                    </w:rPr>
-                                                                    <w:t>plano completa</w:t>
-                                                                  </w:r>
-                                                                  <w:r>
-                                                                    <w:rPr>
-                                                                      <w:rFonts w:ascii="Verdana" w:hAnsi="Verdana" w:eastAsia="Verdana" w:cs="Verdana"/>
-                                                                      <w:color w:val="auto"/>
-                                                                      <w:sz w:val="16"/>
-                                                                      <w:szCs w:val="16"/>
-                                                                      <w:lang w:eastAsia="pt-BR" w:bidi="ar-SA"/>
-                                                                    </w:rPr>
-                                                                    <w:t xml:space="preserve"> aniversário. O reajuste atuarial será informado à ANS em até 30 dias após a sua </w:t>
-                                                                  </w:r>
-                                                                  <w:r>
-                                                                    <w:rPr>
-                                                                      <w:rFonts w:ascii="Verdana" w:hAnsi="Verdana" w:eastAsia="Verdana" w:cs="Verdana"/>
-                                                                      <w:color w:val="auto"/>
-                                                                      <w:sz w:val="16"/>
-                                                                      <w:szCs w:val="16"/>
-                                                                      <w:lang w:eastAsia="pt-BR" w:bidi="ar-SA"/>
-                                                                    </w:rPr>
-                                                                    <w:t>aplicação</w:t>
-                                                                  </w:r>
-                                                                  <w:r>
-                                                                    <w:rPr>
-                                                                      <w:rFonts w:ascii="Verdana" w:hAnsi="Verdana" w:eastAsia="Verdana" w:cs="Verdana"/>
-                                                                      <w:color w:val="auto"/>
-                                                                      <w:sz w:val="16"/>
-                                                                      <w:szCs w:val="16"/>
-                                                                      <w:lang w:eastAsia="pt-BR" w:bidi="ar-SA"/>
-                                                                    </w:rPr>
-                                                                    <w:t>, conforme RN/ANS n° 565/2022.</w:t>
+                                                                      <w:kern w:val="2"/>
+                                                                      <w:sz w:val="16"/>
+                                                                      <w:szCs w:val="16"/>
+                                                                    </w:rPr>
+                                                                    <w:t xml:space="preserve">, o valor da mensalidade sofrerá reajuste atuarial anual de {{ </w:t>
+                                                                  </w:r>
+                                                                  <w:r>
+                                                                    <w:rPr>
+                                                                      <w:rFonts w:ascii="Verdana" w:hAnsi="Verdana" w:eastAsia="Verdana" w:cs="Verdana"/>
+                                                                      <w:b/>
+                                                                      <w:bCs/>
+                                                                      <w:kern w:val="2"/>
+                                                                      <w:sz w:val="16"/>
+                                                                      <w:szCs w:val="16"/>
+                                                                    </w:rPr>
+                                                                    <w:t xml:space="preserve">PORCENTAGEMAUMENTO }} </w:t>
+                                                                  </w:r>
+                                                                  <w:r>
+                                                                    <w:rPr>
+                                                                      <w:rFonts w:ascii="Verdana" w:hAnsi="Verdana" w:eastAsia="Verdana" w:cs="Verdana"/>
+                                                                      <w:kern w:val="2"/>
+                                                                      <w:sz w:val="16"/>
+                                                                      <w:szCs w:val="16"/>
+                                                                    </w:rPr>
+                                                                    <w:t xml:space="preserve">a partir do mês de </w:t>
+                                                                  </w:r>
+                                                                  <w:r>
+                                                                    <w:rPr>
+                                                                      <w:rFonts w:ascii="Verdana" w:hAnsi="Verdana" w:eastAsia="Verdana" w:cs="Verdana"/>
+                                                                      <w:b/>
+                                                                      <w:bCs/>
+                                                                      <w:kern w:val="2"/>
+                                                                      <w:sz w:val="16"/>
+                                                                      <w:szCs w:val="16"/>
+                                                                    </w:rPr>
+                                                                    <w:t xml:space="preserve">{{ MESADESAO }}/2024 </w:t>
+                                                                  </w:r>
+                                                                  <w:r>
+                                                                    <w:rPr>
+                                                                      <w:rFonts w:ascii="Verdana" w:hAnsi="Verdana" w:eastAsia="Verdana" w:cs="Verdana"/>
+                                                                      <w:kern w:val="2"/>
+                                                                      <w:sz w:val="16"/>
+                                                                      <w:szCs w:val="16"/>
+                                                                    </w:rPr>
+                                                                    <w:t>quando seu plano completa aniversário. O reajuste atuarial será informado à ANS em até 30 dias após a sua aplicação, conforme RN/ANS n° 565/2022.</w:t>
                                                                   </w:r>
                                                                 </w:p>
                                                                 <w:p>

</xml_diff>